<commit_message>
NACIE TECDOC: add IGCAR v01 source files
</commit_message>
<xml_diff>
--- a/01-source/annex-III-codes/07-fluent-v01.docx
+++ b/01-source/annex-III-codes/07-fluent-v01.docx
@@ -18,6 +18,77 @@
       <w:r>
         <w:t xml:space="preserve"> flow, and combustion. It provides accurate predictions of fluid behavior, temperature distribution, and heat transfer rates. FLUENT enables the design and analysis of efficient heat exchangers, cooling systems, and thermal management processes, making it essential for industries like automotive, aerospace, and renewable energy. </w:t>
       </w:r>
+    </w:p>
+    <w:p>
+      <w:pPr>
+        <w:spacing w:after="156"/>
+      </w:pPr>
+      <w:r>
+        <w:t>From I</w:t>
+      </w:r>
+      <w:r>
+        <w:t>G</w:t>
+      </w:r>
+      <w:r>
+        <w:t>CAR</w:t>
+      </w:r>
+    </w:p>
+    <w:p>
+      <w:pPr>
+        <w:pStyle w:val="Heading2"/>
+      </w:pPr>
+      <w:bookmarkStart w:id="0" w:name="_Toc228520483"/>
+      <w:r>
+        <w:t>2.</w:t>
+      </w:r>
+      <w:r>
+        <w:tab/>
+      </w:r>
+      <w:r>
+        <w:t>ANSYS Fluent</w:t>
+      </w:r>
+      <w:bookmarkEnd w:id="0"/>
+    </w:p>
+    <w:p>
+      <w:pPr>
+        <w:spacing w:after="156"/>
+        <w:ind w:firstLine="709"/>
+      </w:pPr>
+      <w:r>
+        <w:t xml:space="preserve">ANSYS Fluent is a high-fidelity Computational Fluid Dynamics (CFD) solver widely used for modelling complex fluid-flow and thermal phenomena across a wide range of engineering applications [2]. It provides robust capabilities for simulating laminar and turbulent flows, compressible and incompressible flows, conjugate heat transfer, radiation heat transfer, phase change phenomena, multiphase flows, chemical reactions, combustion, and species transport, among others. Moving and deforming mesh capabilities enable fluid-flow analysis coupled with rigid-body motion, rotating machinery or more complex fluid-structure interaction phenomena. It also provides </w:t>
+      </w:r>
+      <w:r>
+        <w:t>user-defined functions (UDFs)</w:t>
+      </w:r>
+      <w:r>
+        <w:t xml:space="preserve"> to customize and extend solver capabilities by defining additional physics, boundary conditions, source terms, and material properties.</w:t>
+      </w:r>
+    </w:p>
+    <w:p>
+      <w:pPr>
+        <w:spacing w:after="156"/>
+      </w:pPr>
+    </w:p>
+    <w:p>
+      <w:pPr>
+        <w:spacing w:after="156"/>
+      </w:pPr>
+      <w:r>
+        <w:t>References</w:t>
+      </w:r>
+    </w:p>
+    <w:p>
+      <w:pPr>
+        <w:spacing w:after="156"/>
+      </w:pPr>
+      <w:r>
+        <w:t xml:space="preserve">[2] ANSYS Fluent User’s Guide, Release 18.2. </w:t>
+      </w:r>
+    </w:p>
+    <w:p>
+      <w:pPr>
+        <w:spacing w:after="156"/>
+      </w:pPr>
     </w:p>
     <w:sectPr>
       <w:pgSz w:w="11906" w:h="16838"/>
@@ -1052,21 +1123,6 @@
 </file>
 
 <file path=customXml/item1.xml><?xml version="1.0" encoding="utf-8"?>
-<p:properties xmlns:p="http://schemas.microsoft.com/office/2006/metadata/properties" xmlns:xsi="http://www.w3.org/2001/XMLSchema-instance" xmlns:pc="http://schemas.microsoft.com/office/infopath/2007/PartnerControls">
-  <documentManagement/>
-</p:properties>
-</file>
-
-<file path=customXml/item2.xml><?xml version="1.0" encoding="utf-8"?>
-<?mso-contentType ?>
-<FormTemplates xmlns="http://schemas.microsoft.com/sharepoint/v3/contenttype/forms">
-  <Display>DocumentLibraryForm</Display>
-  <Edit>DocumentLibraryForm</Edit>
-  <New>DocumentLibraryForm</New>
-</FormTemplates>
-</file>
-
-<file path=customXml/item3.xml><?xml version="1.0" encoding="utf-8"?>
 <ct:contentTypeSchema xmlns:ct="http://schemas.microsoft.com/office/2006/metadata/contentType" xmlns:ma="http://schemas.microsoft.com/office/2006/metadata/properties/metaAttributes" ct:_="" ma:_="" ma:contentTypeName="Document" ma:contentTypeID="0x010100C38D9328E238A74E9F29FD7E721AEDAB" ma:contentTypeVersion="2" ma:contentTypeDescription="Create a new document." ma:contentTypeScope="" ma:versionID="39ae63eb142d3fe1709322933097f9a4">
   <xsd:schema xmlns:xsd="http://www.w3.org/2001/XMLSchema" xmlns:xs="http://www.w3.org/2001/XMLSchema" xmlns:p="http://schemas.microsoft.com/office/2006/metadata/properties" xmlns:ns2="7e2e151c-dac5-445b-bf96-82805ce2a2c8" targetNamespace="http://schemas.microsoft.com/office/2006/metadata/properties" ma:root="true" ma:fieldsID="39ed7929dde1372f6d17432a2c80d9b3" ns2:_="">
     <xsd:import namespace="7e2e151c-dac5-445b-bf96-82805ce2a2c8"/>
@@ -1214,24 +1270,22 @@
 </ct:contentTypeSchema>
 </file>
 
-<file path=customXml/itemProps1.xml><?xml version="1.0" encoding="utf-8"?>
-<ds:datastoreItem xmlns:ds="http://schemas.openxmlformats.org/officeDocument/2006/customXml" ds:itemID="{A78714B4-6AE9-4B57-B947-61E05AF9A5FB}">
-  <ds:schemaRefs>
-    <ds:schemaRef ds:uri="http://schemas.microsoft.com/office/2006/metadata/properties"/>
-    <ds:schemaRef ds:uri="http://schemas.microsoft.com/office/infopath/2007/PartnerControls"/>
-  </ds:schemaRefs>
-</ds:datastoreItem>
+<file path=customXml/item2.xml><?xml version="1.0" encoding="utf-8"?>
+<p:properties xmlns:p="http://schemas.microsoft.com/office/2006/metadata/properties" xmlns:xsi="http://www.w3.org/2001/XMLSchema-instance" xmlns:pc="http://schemas.microsoft.com/office/infopath/2007/PartnerControls">
+  <documentManagement/>
+</p:properties>
 </file>
 
-<file path=customXml/itemProps2.xml><?xml version="1.0" encoding="utf-8"?>
-<ds:datastoreItem xmlns:ds="http://schemas.openxmlformats.org/officeDocument/2006/customXml" ds:itemID="{DA5EB035-7A31-46DA-A159-AA7F1B70371F}">
-  <ds:schemaRefs>
-    <ds:schemaRef ds:uri="http://schemas.microsoft.com/sharepoint/v3/contenttype/forms"/>
-  </ds:schemaRefs>
-</ds:datastoreItem>
+<file path=customXml/item3.xml><?xml version="1.0" encoding="utf-8"?>
+<?mso-contentType ?>
+<FormTemplates xmlns="http://schemas.microsoft.com/sharepoint/v3/contenttype/forms">
+  <Display>DocumentLibraryForm</Display>
+  <Edit>DocumentLibraryForm</Edit>
+  <New>DocumentLibraryForm</New>
+</FormTemplates>
 </file>
 
-<file path=customXml/itemProps3.xml><?xml version="1.0" encoding="utf-8"?>
+<file path=customXml/itemProps1.xml><?xml version="1.0" encoding="utf-8"?>
 <ds:datastoreItem xmlns:ds="http://schemas.openxmlformats.org/officeDocument/2006/customXml" ds:itemID="{F59C5A13-4916-4124-AFD6-7B5C345528C4}">
   <ds:schemaRefs>
     <ds:schemaRef ds:uri="http://schemas.microsoft.com/office/2006/metadata/contentType"/>
@@ -1247,4 +1301,21 @@
     <ds:schemaRef ds:uri="http://schemas.microsoft.com/internal/obd"/>
   </ds:schemaRefs>
 </ds:datastoreItem>
+</file>
+
+<file path=customXml/itemProps2.xml><?xml version="1.0" encoding="utf-8"?>
+<ds:datastoreItem xmlns:ds="http://schemas.openxmlformats.org/officeDocument/2006/customXml" ds:itemID="{A78714B4-6AE9-4B57-B947-61E05AF9A5FB}">
+  <ds:schemaRefs>
+    <ds:schemaRef ds:uri="http://schemas.microsoft.com/office/2006/metadata/properties"/>
+    <ds:schemaRef ds:uri="http://schemas.microsoft.com/office/infopath/2007/PartnerControls"/>
+  </ds:schemaRefs>
+</ds:datastoreItem>
+</file>
+
+<file path=customXml/itemProps3.xml><?xml version="1.0" encoding="utf-8"?>
+<ds:datastoreItem xmlns:ds="http://schemas.openxmlformats.org/officeDocument/2006/customXml" ds:itemID="{DA5EB035-7A31-46DA-A159-AA7F1B70371F}">
+  <ds:schemaRefs>
+    <ds:schemaRef ds:uri="http://schemas.microsoft.com/sharepoint/v3/contenttype/forms"/>
+  </ds:schemaRefs>
+</ds:datastoreItem>
 </file>
</xml_diff>